<commit_message>
feat(sow): per-SDLC-phase milestone schedule for Deliverables (BR-7)
Replace the generic "Deliverable 1/2/3" with a phase-based milestone
schedule: each SDLC phase is a billable milestone invoiced on acceptance,
priced from the estimate's cost-per-phase (which already flows into the SOW
as pricing.phases).

- SowPrintPage §7 → "Deliverables & Milestone Schedule": editable intro + a
  computed table (Phase/Milestone · one-time milestone fee · recurring
  monthly · recurring yearly + totals), with an invoice-on-acceptance note;
  amounts exclude contingency (carried in §9 Pricing). Pricing stays §9.
- SOW default deliverables boilerplate now describes phase-milestone billing.
- SOW_TEMPLATE.md §9 rewritten to a phase/milestone schedule with {{PHASE_*}}
  tokens + invoice triggers; .docx re-rendered.

Co-Authored-By: Claude Opus 4.8 (1M context) <noreply@anthropic.com>
</commit_message>
<xml_diff>
--- a/docs/templates/SOW_TEMPLATE.docx
+++ b/docs/templates/SOW_TEMPLATE.docx
@@ -3315,13 +3315,119 @@
       </w:r>
     </w:p>
     <w:bookmarkEnd w:id="28"/>
-    <w:bookmarkStart w:id="29" w:name="deliverables"/>
+    <w:bookmarkStart w:id="29" w:name="deliverables-milestone-schedule"/>
     <w:p>
       <w:pPr>
         <w:pStyle w:val="Heading2"/>
       </w:pPr>
       <w:r>
-        <w:t xml:space="preserve">9. Deliverables</w:t>
+        <w:t xml:space="preserve">9. Deliverables &amp; Milestone Schedule</w:t>
+      </w:r>
+    </w:p>
+    <w:p>
+      <w:pPr>
+        <w:pStyle w:val="FirstParagraph"/>
+      </w:pPr>
+      <w:r>
+        <w:t xml:space="preserve">Deliverables are organized by</w:t>
+      </w:r>
+      <w:r>
+        <w:t xml:space="preserve"> </w:t>
+      </w:r>
+      <w:r>
+        <w:rPr>
+          <w:b/>
+          <w:bCs/>
+        </w:rPr>
+        <w:t xml:space="preserve">SDLC phase</w:t>
+      </w:r>
+      <w:r>
+        <w:t xml:space="preserve">. Each phase is a</w:t>
+      </w:r>
+      <w:r>
+        <w:t xml:space="preserve"> </w:t>
+      </w:r>
+      <w:r>
+        <w:rPr>
+          <w:b/>
+          <w:bCs/>
+        </w:rPr>
+        <w:t xml:space="preserve">billable milestone</w:t>
+      </w:r>
+      <w:r>
+        <w:t xml:space="preserve">: upon the</w:t>
+      </w:r>
+      <w:r>
+        <w:t xml:space="preserve"> </w:t>
+      </w:r>
+      <w:r>
+        <w:t xml:space="preserve">Client’s written acceptance of that phase’s deliverables, the Provider invoices the phase’s</w:t>
+      </w:r>
+      <w:r>
+        <w:t xml:space="preserve"> </w:t>
+      </w:r>
+      <w:r>
+        <w:rPr>
+          <w:b/>
+          <w:bCs/>
+        </w:rPr>
+        <w:t xml:space="preserve">one-time milestone fee</w:t>
+      </w:r>
+      <w:r>
+        <w:t xml:space="preserve"> </w:t>
+      </w:r>
+      <w:r>
+        <w:t xml:space="preserve">per the schedule below. The fees are derived from the approved</w:t>
+      </w:r>
+      <w:r>
+        <w:t xml:space="preserve"> </w:t>
+      </w:r>
+      <w:r>
+        <w:t xml:space="preserve">estimate’s</w:t>
+      </w:r>
+      <w:r>
+        <w:t xml:space="preserve"> </w:t>
+      </w:r>
+      <w:r>
+        <w:rPr>
+          <w:b/>
+          <w:bCs/>
+        </w:rPr>
+        <w:t xml:space="preserve">cost per phase</w:t>
+      </w:r>
+      <w:r>
+        <w:t xml:space="preserve"> </w:t>
+      </w:r>
+      <w:r>
+        <w:t xml:space="preserve">— when generated from a Kerdos estimate, this table is populated</w:t>
+      </w:r>
+      <w:r>
+        <w:t xml:space="preserve"> </w:t>
+      </w:r>
+      <w:r>
+        <w:t xml:space="preserve">from the estimate’s per-phase totals. Recurring costs (e.g. cloud, licenses) are billed on their</w:t>
+      </w:r>
+      <w:r>
+        <w:t xml:space="preserve"> </w:t>
+      </w:r>
+      <w:r>
+        <w:t xml:space="preserve">stated cadence and are</w:t>
+      </w:r>
+      <w:r>
+        <w:t xml:space="preserve"> </w:t>
+      </w:r>
+      <w:r>
+        <w:rPr>
+          <w:b/>
+          <w:bCs/>
+        </w:rPr>
+        <w:t xml:space="preserve">not</w:t>
+      </w:r>
+      <w:r>
+        <w:t xml:space="preserve"> </w:t>
+      </w:r>
+      <w:r>
+        <w:t xml:space="preserve">milestones.</w:t>
       </w:r>
     </w:p>
     <w:tbl>
@@ -3332,9 +3438,12 @@
         <w:tblLook w:firstRow="1" w:lastRow="0" w:firstColumn="0" w:lastColumn="0" w:noHBand="0" w:noVBand="0" w:val="0020"/>
       </w:tblPr>
       <w:tblGrid>
-        <w:gridCol w:w="1949"/>
-        <w:gridCol w:w="3228"/>
-        <w:gridCol w:w="2741"/>
+        <w:gridCol w:w="1146"/>
+        <w:gridCol w:w="1563"/>
+        <w:gridCol w:w="1354"/>
+        <w:gridCol w:w="1302"/>
+        <w:gridCol w:w="1250"/>
+        <w:gridCol w:w="1302"/>
       </w:tblGrid>
       <w:tr>
         <w:trPr>
@@ -3347,594 +3456,666 @@
               <w:pStyle w:val="Compact"/>
             </w:pPr>
             <w:r>
-              <w:t xml:space="preserve">Deliverable</w:t>
-            </w:r>
-          </w:p>
-        </w:tc>
-        <w:tc>
-          <w:tcPr/>
-          <w:p>
-            <w:pPr>
-              <w:pStyle w:val="Compact"/>
-            </w:pPr>
-            <w:r>
-              <w:t xml:space="preserve">Description</w:t>
-            </w:r>
-          </w:p>
-        </w:tc>
-        <w:tc>
-          <w:tcPr/>
-          <w:p>
-            <w:pPr>
-              <w:pStyle w:val="Compact"/>
-            </w:pPr>
-            <w:r>
-              <w:t xml:space="preserve">Acceptance Criteria</w:t>
-            </w:r>
-          </w:p>
-        </w:tc>
-      </w:tr>
-      <w:tr>
-        <w:tc>
-          <w:tcPr/>
-          <w:p>
-            <w:pPr>
-              <w:pStyle w:val="Compact"/>
-            </w:pPr>
-            <w:r>
-              <w:t xml:space="preserve">Project Management Plan</w:t>
-            </w:r>
-          </w:p>
-        </w:tc>
-        <w:tc>
-          <w:tcPr/>
-          <w:p>
-            <w:pPr>
-              <w:pStyle w:val="Compact"/>
-            </w:pPr>
-            <w:r>
-              <w:t xml:space="preserve">Schedule, governance, risks, communication, reporting</w:t>
-            </w:r>
-          </w:p>
-        </w:tc>
-        <w:tc>
-          <w:tcPr/>
-          <w:p>
-            <w:pPr>
-              <w:pStyle w:val="Compact"/>
-            </w:pPr>
-            <w:r>
-              <w:t xml:space="preserve">Approved by customer</w:t>
-            </w:r>
-          </w:p>
-        </w:tc>
-      </w:tr>
-      <w:tr>
-        <w:tc>
-          <w:tcPr/>
-          <w:p>
-            <w:pPr>
-              <w:pStyle w:val="Compact"/>
-            </w:pPr>
-            <w:r>
-              <w:t xml:space="preserve">Requirements Document</w:t>
-            </w:r>
-          </w:p>
-        </w:tc>
-        <w:tc>
-          <w:tcPr/>
-          <w:p>
-            <w:pPr>
-              <w:pStyle w:val="Compact"/>
-            </w:pPr>
-            <w:r>
-              <w:t xml:space="preserve">Functional and non-functional requirements</w:t>
-            </w:r>
-          </w:p>
-        </w:tc>
-        <w:tc>
-          <w:tcPr/>
-          <w:p>
-            <w:pPr>
-              <w:pStyle w:val="Compact"/>
-            </w:pPr>
-            <w:r>
-              <w:t xml:space="preserve">Approved by business + technical stakeholders</w:t>
-            </w:r>
-          </w:p>
-        </w:tc>
-      </w:tr>
-      <w:tr>
-        <w:tc>
-          <w:tcPr/>
-          <w:p>
-            <w:pPr>
-              <w:pStyle w:val="Compact"/>
-            </w:pPr>
-            <w:r>
-              <w:t xml:space="preserve">Requirements Traceability Matrix</w:t>
-            </w:r>
-          </w:p>
-        </w:tc>
-        <w:tc>
-          <w:tcPr/>
-          <w:p>
-            <w:pPr>
-              <w:pStyle w:val="Compact"/>
-            </w:pPr>
-            <w:r>
-              <w:t xml:space="preserve">Maps requirements to design, build, test, acceptance</w:t>
-            </w:r>
-          </w:p>
-        </w:tc>
-        <w:tc>
-          <w:tcPr/>
-          <w:p>
-            <w:pPr>
-              <w:pStyle w:val="Compact"/>
-            </w:pPr>
-            <w:r>
-              <w:t xml:space="preserve">Complete and reviewed</w:t>
-            </w:r>
-          </w:p>
-        </w:tc>
-      </w:tr>
-      <w:tr>
-        <w:tc>
-          <w:tcPr/>
-          <w:p>
-            <w:pPr>
-              <w:pStyle w:val="Compact"/>
-            </w:pPr>
-            <w:r>
-              <w:t xml:space="preserve">Solution Architecture Document</w:t>
-            </w:r>
-          </w:p>
-        </w:tc>
-        <w:tc>
-          <w:tcPr/>
-          <w:p>
-            <w:pPr>
-              <w:pStyle w:val="Compact"/>
-            </w:pPr>
-            <w:r>
-              <w:t xml:space="preserve">Target architecture and major design decisions</w:t>
-            </w:r>
-          </w:p>
-        </w:tc>
-        <w:tc>
-          <w:tcPr/>
-          <w:p>
-            <w:pPr>
-              <w:pStyle w:val="Compact"/>
-            </w:pPr>
-            <w:r>
-              <w:t xml:space="preserve">Approved by architecture stakeholders</w:t>
-            </w:r>
-          </w:p>
-        </w:tc>
-      </w:tr>
-      <w:tr>
-        <w:tc>
-          <w:tcPr/>
-          <w:p>
-            <w:pPr>
-              <w:pStyle w:val="Compact"/>
-            </w:pPr>
-            <w:r>
-              <w:t xml:space="preserve">Technical Design Document</w:t>
-            </w:r>
-          </w:p>
-        </w:tc>
-        <w:tc>
-          <w:tcPr/>
-          <w:p>
-            <w:pPr>
-              <w:pStyle w:val="Compact"/>
-            </w:pPr>
-            <w:r>
-              <w:t xml:space="preserve">Application, data, integration, security design</w:t>
-            </w:r>
-          </w:p>
-        </w:tc>
-        <w:tc>
-          <w:tcPr/>
-          <w:p>
-            <w:pPr>
-              <w:pStyle w:val="Compact"/>
-            </w:pPr>
-            <w:r>
-              <w:t xml:space="preserve">Approved by technical stakeholders</w:t>
-            </w:r>
-          </w:p>
-        </w:tc>
-      </w:tr>
-      <w:tr>
-        <w:tc>
-          <w:tcPr/>
-          <w:p>
-            <w:pPr>
-              <w:pStyle w:val="Compact"/>
-            </w:pPr>
-            <w:r>
-              <w:t xml:space="preserve">Data Model</w:t>
-            </w:r>
-          </w:p>
-        </w:tc>
-        <w:tc>
-          <w:tcPr/>
-          <w:p>
-            <w:pPr>
-              <w:pStyle w:val="Compact"/>
-            </w:pPr>
-            <w:r>
-              <w:t xml:space="preserve">Logical and physical data structures</w:t>
-            </w:r>
-          </w:p>
-        </w:tc>
-        <w:tc>
-          <w:tcPr/>
-          <w:p>
-            <w:pPr>
-              <w:pStyle w:val="Compact"/>
-            </w:pPr>
-            <w:r>
-              <w:t xml:space="preserve">Reviewed and approved</w:t>
-            </w:r>
-          </w:p>
-        </w:tc>
-      </w:tr>
-      <w:tr>
-        <w:tc>
-          <w:tcPr/>
-          <w:p>
-            <w:pPr>
-              <w:pStyle w:val="Compact"/>
-            </w:pPr>
-            <w:r>
-              <w:t xml:space="preserve">Integration Design</w:t>
-            </w:r>
-          </w:p>
-        </w:tc>
-        <w:tc>
-          <w:tcPr/>
-          <w:p>
-            <w:pPr>
-              <w:pStyle w:val="Compact"/>
-            </w:pPr>
-            <w:r>
-              <w:t xml:space="preserve">APIs, batch jobs, files, messages, event flows</w:t>
-            </w:r>
-          </w:p>
-        </w:tc>
-        <w:tc>
-          <w:tcPr/>
-          <w:p>
-            <w:pPr>
-              <w:pStyle w:val="Compact"/>
-            </w:pPr>
-            <w:r>
-              <w:t xml:space="preserve">Reviewed and approved</w:t>
-            </w:r>
-          </w:p>
-        </w:tc>
-      </w:tr>
-      <w:tr>
-        <w:tc>
-          <w:tcPr/>
-          <w:p>
-            <w:pPr>
-              <w:pStyle w:val="Compact"/>
-            </w:pPr>
-            <w:r>
-              <w:t xml:space="preserve">Security Design</w:t>
-            </w:r>
-          </w:p>
-        </w:tc>
-        <w:tc>
-          <w:tcPr/>
-          <w:p>
-            <w:pPr>
-              <w:pStyle w:val="Compact"/>
-            </w:pPr>
-            <w:r>
-              <w:t xml:space="preserve">Authn, authz, encryption, logging, controls</w:t>
-            </w:r>
-          </w:p>
-        </w:tc>
-        <w:tc>
-          <w:tcPr/>
-          <w:p>
-            <w:pPr>
-              <w:pStyle w:val="Compact"/>
-            </w:pPr>
-            <w:r>
-              <w:t xml:space="preserve">Approved by security stakeholders</w:t>
-            </w:r>
-          </w:p>
-        </w:tc>
-      </w:tr>
-      <w:tr>
-        <w:tc>
-          <w:tcPr/>
-          <w:p>
-            <w:pPr>
-              <w:pStyle w:val="Compact"/>
-            </w:pPr>
-            <w:r>
-              <w:t xml:space="preserve">Test Strategy</w:t>
-            </w:r>
-          </w:p>
-        </w:tc>
-        <w:tc>
-          <w:tcPr/>
-          <w:p>
-            <w:pPr>
-              <w:pStyle w:val="Compact"/>
-            </w:pPr>
-            <w:r>
-              <w:t xml:space="preserve">Testing approach and responsibilities</w:t>
-            </w:r>
-          </w:p>
-        </w:tc>
-        <w:tc>
-          <w:tcPr/>
-          <w:p>
-            <w:pPr>
-              <w:pStyle w:val="Compact"/>
-            </w:pPr>
-            <w:r>
-              <w:t xml:space="preserve">Approved by project leadership</w:t>
-            </w:r>
-          </w:p>
-        </w:tc>
-      </w:tr>
-      <w:tr>
-        <w:tc>
-          <w:tcPr/>
-          <w:p>
-            <w:pPr>
-              <w:pStyle w:val="Compact"/>
-            </w:pPr>
-            <w:r>
-              <w:t xml:space="preserve">Test Cases and Results</w:t>
-            </w:r>
-          </w:p>
-        </w:tc>
-        <w:tc>
-          <w:tcPr/>
-          <w:p>
-            <w:pPr>
-              <w:pStyle w:val="Compact"/>
-            </w:pPr>
-            <w:r>
-              <w:t xml:space="preserve">Executed tests and results</w:t>
-            </w:r>
-          </w:p>
-        </w:tc>
-        <w:tc>
-          <w:tcPr/>
-          <w:p>
-            <w:pPr>
-              <w:pStyle w:val="Compact"/>
-            </w:pPr>
-            <w:r>
-              <w:t xml:space="preserve">Meets exit criteria</w:t>
-            </w:r>
-          </w:p>
-        </w:tc>
-      </w:tr>
-      <w:tr>
-        <w:tc>
-          <w:tcPr/>
-          <w:p>
-            <w:pPr>
-              <w:pStyle w:val="Compact"/>
-            </w:pPr>
-            <w:r>
-              <w:t xml:space="preserve">Deployment Plan</w:t>
-            </w:r>
-          </w:p>
-        </w:tc>
-        <w:tc>
-          <w:tcPr/>
-          <w:p>
-            <w:pPr>
-              <w:pStyle w:val="Compact"/>
-            </w:pPr>
-            <w:r>
-              <w:t xml:space="preserve">Production implementation steps</w:t>
-            </w:r>
-          </w:p>
-        </w:tc>
-        <w:tc>
-          <w:tcPr/>
-          <w:p>
-            <w:pPr>
-              <w:pStyle w:val="Compact"/>
-            </w:pPr>
-            <w:r>
-              <w:t xml:space="preserve">Approved before go-live</w:t>
-            </w:r>
-          </w:p>
-        </w:tc>
-      </w:tr>
-      <w:tr>
-        <w:tc>
-          <w:tcPr/>
-          <w:p>
-            <w:pPr>
-              <w:pStyle w:val="Compact"/>
-            </w:pPr>
-            <w:r>
-              <w:t xml:space="preserve">Rollback Plan</w:t>
-            </w:r>
-          </w:p>
-        </w:tc>
-        <w:tc>
-          <w:tcPr/>
-          <w:p>
-            <w:pPr>
-              <w:pStyle w:val="Compact"/>
-            </w:pPr>
-            <w:r>
-              <w:t xml:space="preserve">Recovery approach if deployment fails</w:t>
-            </w:r>
-          </w:p>
-        </w:tc>
-        <w:tc>
-          <w:tcPr/>
-          <w:p>
-            <w:pPr>
-              <w:pStyle w:val="Compact"/>
-            </w:pPr>
-            <w:r>
-              <w:t xml:space="preserve">Approved before go-live</w:t>
-            </w:r>
-          </w:p>
-        </w:tc>
-      </w:tr>
-      <w:tr>
-        <w:tc>
-          <w:tcPr/>
-          <w:p>
-            <w:pPr>
-              <w:pStyle w:val="Compact"/>
-            </w:pPr>
-            <w:r>
-              <w:t xml:space="preserve">User Guide</w:t>
-            </w:r>
-          </w:p>
-        </w:tc>
-        <w:tc>
-          <w:tcPr/>
-          <w:p>
-            <w:pPr>
-              <w:pStyle w:val="Compact"/>
-            </w:pPr>
-            <w:r>
-              <w:t xml:space="preserve">Supports end-user adoption</w:t>
-            </w:r>
-          </w:p>
-        </w:tc>
-        <w:tc>
-          <w:tcPr/>
-          <w:p>
-            <w:pPr>
-              <w:pStyle w:val="Compact"/>
-            </w:pPr>
-            <w:r>
-              <w:t xml:space="preserve">Reviewed and accepted</w:t>
-            </w:r>
-          </w:p>
-        </w:tc>
-      </w:tr>
-      <w:tr>
-        <w:tc>
-          <w:tcPr/>
-          <w:p>
-            <w:pPr>
-              <w:pStyle w:val="Compact"/>
-            </w:pPr>
-            <w:r>
-              <w:t xml:space="preserve">Operations Runbook</w:t>
-            </w:r>
-          </w:p>
-        </w:tc>
-        <w:tc>
-          <w:tcPr/>
-          <w:p>
-            <w:pPr>
-              <w:pStyle w:val="Compact"/>
-            </w:pPr>
-            <w:r>
-              <w:t xml:space="preserve">Supports production operations</w:t>
-            </w:r>
-          </w:p>
-        </w:tc>
-        <w:tc>
-          <w:tcPr/>
-          <w:p>
-            <w:pPr>
-              <w:pStyle w:val="Compact"/>
-            </w:pPr>
-            <w:r>
-              <w:t xml:space="preserve">Reviewed and accepted</w:t>
-            </w:r>
-          </w:p>
-        </w:tc>
-      </w:tr>
-      <w:tr>
-        <w:tc>
-          <w:tcPr/>
-          <w:p>
-            <w:pPr>
-              <w:pStyle w:val="Compact"/>
-            </w:pPr>
-            <w:r>
-              <w:t xml:space="preserve">Knowledge Transfer Materials</w:t>
-            </w:r>
-          </w:p>
-        </w:tc>
-        <w:tc>
-          <w:tcPr/>
-          <w:p>
-            <w:pPr>
-              <w:pStyle w:val="Compact"/>
-            </w:pPr>
-            <w:r>
-              <w:t xml:space="preserve">Supports customer/support handoff</w:t>
-            </w:r>
-          </w:p>
-        </w:tc>
-        <w:tc>
-          <w:tcPr/>
-          <w:p>
-            <w:pPr>
-              <w:pStyle w:val="Compact"/>
-            </w:pPr>
-            <w:r>
-              <w:t xml:space="preserve">Delivered and reviewed</w:t>
-            </w:r>
-          </w:p>
-        </w:tc>
-      </w:tr>
-      <w:tr>
-        <w:tc>
-          <w:tcPr/>
-          <w:p>
-            <w:pPr>
-              <w:pStyle w:val="Compact"/>
-            </w:pPr>
-            <w:r>
-              <w:t xml:space="preserve">Final Acceptance Package</w:t>
-            </w:r>
-          </w:p>
-        </w:tc>
-        <w:tc>
-          <w:tcPr/>
-          <w:p>
-            <w:pPr>
-              <w:pStyle w:val="Compact"/>
-            </w:pPr>
-            <w:r>
-              <w:t xml:space="preserve">Confirms delivery completion</w:t>
-            </w:r>
-          </w:p>
-        </w:tc>
-        <w:tc>
-          <w:tcPr/>
-          <w:p>
-            <w:pPr>
-              <w:pStyle w:val="Compact"/>
-            </w:pPr>
-            <w:r>
-              <w:t xml:space="preserve">Signed by customer</w:t>
-            </w:r>
+              <w:t xml:space="preserve">SDLC Phase (Milestone)</w:t>
+            </w:r>
+          </w:p>
+        </w:tc>
+        <w:tc>
+          <w:tcPr/>
+          <w:p>
+            <w:pPr>
+              <w:pStyle w:val="Compact"/>
+            </w:pPr>
+            <w:r>
+              <w:t xml:space="preserve">Key Deliverables</w:t>
+            </w:r>
+          </w:p>
+        </w:tc>
+        <w:tc>
+          <w:tcPr/>
+          <w:p>
+            <w:pPr>
+              <w:pStyle w:val="Compact"/>
+              <w:jc w:val="right"/>
+            </w:pPr>
+            <w:r>
+              <w:t xml:space="preserve">Milestone Fee (one-time)</w:t>
+            </w:r>
+          </w:p>
+        </w:tc>
+        <w:tc>
+          <w:tcPr/>
+          <w:p>
+            <w:pPr>
+              <w:pStyle w:val="Compact"/>
+              <w:jc w:val="right"/>
+            </w:pPr>
+            <w:r>
+              <w:t xml:space="preserve">Recurring (monthly)</w:t>
+            </w:r>
+          </w:p>
+        </w:tc>
+        <w:tc>
+          <w:tcPr/>
+          <w:p>
+            <w:pPr>
+              <w:pStyle w:val="Compact"/>
+              <w:jc w:val="right"/>
+            </w:pPr>
+            <w:r>
+              <w:t xml:space="preserve">Recurring (yearly)</w:t>
+            </w:r>
+          </w:p>
+        </w:tc>
+        <w:tc>
+          <w:tcPr/>
+          <w:p>
+            <w:pPr>
+              <w:pStyle w:val="Compact"/>
+            </w:pPr>
+            <w:r>
+              <w:t xml:space="preserve">Invoice Trigger</w:t>
+            </w:r>
+          </w:p>
+        </w:tc>
+      </w:tr>
+      <w:tr>
+        <w:tc>
+          <w:tcPr/>
+          <w:p>
+            <w:pPr>
+              <w:pStyle w:val="Compact"/>
+            </w:pPr>
+            <w:r>
+              <w:t xml:space="preserve">Planning</w:t>
+            </w:r>
+          </w:p>
+        </w:tc>
+        <w:tc>
+          <w:tcPr/>
+          <w:p>
+            <w:pPr>
+              <w:pStyle w:val="Compact"/>
+            </w:pPr>
+            <w:r>
+              <w:rPr>
+                <w:rStyle w:val="VerbatimChar"/>
+              </w:rPr>
+              <w:t xml:space="preserve">{{PLANNING_DELIVERABLES}}</w:t>
+            </w:r>
+          </w:p>
+        </w:tc>
+        <w:tc>
+          <w:tcPr/>
+          <w:p>
+            <w:pPr>
+              <w:pStyle w:val="Compact"/>
+              <w:jc w:val="right"/>
+            </w:pPr>
+            <w:r>
+              <w:rPr>
+                <w:rStyle w:val="VerbatimChar"/>
+              </w:rPr>
+              <w:t xml:space="preserve">{{PLANNING_ONE_TIME}}</w:t>
+            </w:r>
+          </w:p>
+        </w:tc>
+        <w:tc>
+          <w:tcPr/>
+          <w:p>
+            <w:pPr>
+              <w:pStyle w:val="Compact"/>
+              <w:jc w:val="right"/>
+            </w:pPr>
+            <w:r>
+              <w:rPr>
+                <w:rStyle w:val="VerbatimChar"/>
+              </w:rPr>
+              <w:t xml:space="preserve">{{PLANNING_MONTHLY}}</w:t>
+            </w:r>
+          </w:p>
+        </w:tc>
+        <w:tc>
+          <w:tcPr/>
+          <w:p>
+            <w:pPr>
+              <w:pStyle w:val="Compact"/>
+              <w:jc w:val="right"/>
+            </w:pPr>
+            <w:r>
+              <w:rPr>
+                <w:rStyle w:val="VerbatimChar"/>
+              </w:rPr>
+              <w:t xml:space="preserve">{{PLANNING_YEARLY}}</w:t>
+            </w:r>
+          </w:p>
+        </w:tc>
+        <w:tc>
+          <w:tcPr/>
+          <w:p>
+            <w:pPr>
+              <w:pStyle w:val="Compact"/>
+            </w:pPr>
+            <w:r>
+              <w:t xml:space="preserve">Acceptance of Planning</w:t>
+            </w:r>
+          </w:p>
+        </w:tc>
+      </w:tr>
+      <w:tr>
+        <w:tc>
+          <w:tcPr/>
+          <w:p>
+            <w:pPr>
+              <w:pStyle w:val="Compact"/>
+            </w:pPr>
+            <w:r>
+              <w:t xml:space="preserve">Design</w:t>
+            </w:r>
+          </w:p>
+        </w:tc>
+        <w:tc>
+          <w:tcPr/>
+          <w:p>
+            <w:pPr>
+              <w:pStyle w:val="Compact"/>
+            </w:pPr>
+            <w:r>
+              <w:rPr>
+                <w:rStyle w:val="VerbatimChar"/>
+              </w:rPr>
+              <w:t xml:space="preserve">{{DESIGN_DELIVERABLES}}</w:t>
+            </w:r>
+          </w:p>
+        </w:tc>
+        <w:tc>
+          <w:tcPr/>
+          <w:p>
+            <w:pPr>
+              <w:pStyle w:val="Compact"/>
+              <w:jc w:val="right"/>
+            </w:pPr>
+            <w:r>
+              <w:rPr>
+                <w:rStyle w:val="VerbatimChar"/>
+              </w:rPr>
+              <w:t xml:space="preserve">{{DESIGN_ONE_TIME}}</w:t>
+            </w:r>
+          </w:p>
+        </w:tc>
+        <w:tc>
+          <w:tcPr/>
+          <w:p>
+            <w:pPr>
+              <w:pStyle w:val="Compact"/>
+              <w:jc w:val="right"/>
+            </w:pPr>
+            <w:r>
+              <w:rPr>
+                <w:rStyle w:val="VerbatimChar"/>
+              </w:rPr>
+              <w:t xml:space="preserve">{{DESIGN_MONTHLY}}</w:t>
+            </w:r>
+          </w:p>
+        </w:tc>
+        <w:tc>
+          <w:tcPr/>
+          <w:p>
+            <w:pPr>
+              <w:pStyle w:val="Compact"/>
+              <w:jc w:val="right"/>
+            </w:pPr>
+            <w:r>
+              <w:rPr>
+                <w:rStyle w:val="VerbatimChar"/>
+              </w:rPr>
+              <w:t xml:space="preserve">{{DESIGN_YEARLY}}</w:t>
+            </w:r>
+          </w:p>
+        </w:tc>
+        <w:tc>
+          <w:tcPr/>
+          <w:p>
+            <w:pPr>
+              <w:pStyle w:val="Compact"/>
+            </w:pPr>
+            <w:r>
+              <w:t xml:space="preserve">Acceptance of Design</w:t>
+            </w:r>
+          </w:p>
+        </w:tc>
+      </w:tr>
+      <w:tr>
+        <w:tc>
+          <w:tcPr/>
+          <w:p>
+            <w:pPr>
+              <w:pStyle w:val="Compact"/>
+            </w:pPr>
+            <w:r>
+              <w:t xml:space="preserve">Development</w:t>
+            </w:r>
+          </w:p>
+        </w:tc>
+        <w:tc>
+          <w:tcPr/>
+          <w:p>
+            <w:pPr>
+              <w:pStyle w:val="Compact"/>
+            </w:pPr>
+            <w:r>
+              <w:rPr>
+                <w:rStyle w:val="VerbatimChar"/>
+              </w:rPr>
+              <w:t xml:space="preserve">{{DEVELOPMENT_DELIVERABLES}}</w:t>
+            </w:r>
+          </w:p>
+        </w:tc>
+        <w:tc>
+          <w:tcPr/>
+          <w:p>
+            <w:pPr>
+              <w:pStyle w:val="Compact"/>
+              <w:jc w:val="right"/>
+            </w:pPr>
+            <w:r>
+              <w:rPr>
+                <w:rStyle w:val="VerbatimChar"/>
+              </w:rPr>
+              <w:t xml:space="preserve">{{DEVELOPMENT_ONE_TIME}}</w:t>
+            </w:r>
+          </w:p>
+        </w:tc>
+        <w:tc>
+          <w:tcPr/>
+          <w:p>
+            <w:pPr>
+              <w:pStyle w:val="Compact"/>
+              <w:jc w:val="right"/>
+            </w:pPr>
+            <w:r>
+              <w:rPr>
+                <w:rStyle w:val="VerbatimChar"/>
+              </w:rPr>
+              <w:t xml:space="preserve">{{DEVELOPMENT_MONTHLY}}</w:t>
+            </w:r>
+          </w:p>
+        </w:tc>
+        <w:tc>
+          <w:tcPr/>
+          <w:p>
+            <w:pPr>
+              <w:pStyle w:val="Compact"/>
+              <w:jc w:val="right"/>
+            </w:pPr>
+            <w:r>
+              <w:rPr>
+                <w:rStyle w:val="VerbatimChar"/>
+              </w:rPr>
+              <w:t xml:space="preserve">{{DEVELOPMENT_YEARLY}}</w:t>
+            </w:r>
+          </w:p>
+        </w:tc>
+        <w:tc>
+          <w:tcPr/>
+          <w:p>
+            <w:pPr>
+              <w:pStyle w:val="Compact"/>
+            </w:pPr>
+            <w:r>
+              <w:t xml:space="preserve">Acceptance of Development</w:t>
+            </w:r>
+          </w:p>
+        </w:tc>
+      </w:tr>
+      <w:tr>
+        <w:tc>
+          <w:tcPr/>
+          <w:p>
+            <w:pPr>
+              <w:pStyle w:val="Compact"/>
+            </w:pPr>
+            <w:r>
+              <w:t xml:space="preserve">Testing</w:t>
+            </w:r>
+          </w:p>
+        </w:tc>
+        <w:tc>
+          <w:tcPr/>
+          <w:p>
+            <w:pPr>
+              <w:pStyle w:val="Compact"/>
+            </w:pPr>
+            <w:r>
+              <w:rPr>
+                <w:rStyle w:val="VerbatimChar"/>
+              </w:rPr>
+              <w:t xml:space="preserve">{{TESTING_DELIVERABLES}}</w:t>
+            </w:r>
+          </w:p>
+        </w:tc>
+        <w:tc>
+          <w:tcPr/>
+          <w:p>
+            <w:pPr>
+              <w:pStyle w:val="Compact"/>
+              <w:jc w:val="right"/>
+            </w:pPr>
+            <w:r>
+              <w:rPr>
+                <w:rStyle w:val="VerbatimChar"/>
+              </w:rPr>
+              <w:t xml:space="preserve">{{TESTING_ONE_TIME}}</w:t>
+            </w:r>
+          </w:p>
+        </w:tc>
+        <w:tc>
+          <w:tcPr/>
+          <w:p>
+            <w:pPr>
+              <w:pStyle w:val="Compact"/>
+              <w:jc w:val="right"/>
+            </w:pPr>
+            <w:r>
+              <w:rPr>
+                <w:rStyle w:val="VerbatimChar"/>
+              </w:rPr>
+              <w:t xml:space="preserve">{{TESTING_MONTHLY}}</w:t>
+            </w:r>
+          </w:p>
+        </w:tc>
+        <w:tc>
+          <w:tcPr/>
+          <w:p>
+            <w:pPr>
+              <w:pStyle w:val="Compact"/>
+              <w:jc w:val="right"/>
+            </w:pPr>
+            <w:r>
+              <w:rPr>
+                <w:rStyle w:val="VerbatimChar"/>
+              </w:rPr>
+              <w:t xml:space="preserve">{{TESTING_YEARLY}}</w:t>
+            </w:r>
+          </w:p>
+        </w:tc>
+        <w:tc>
+          <w:tcPr/>
+          <w:p>
+            <w:pPr>
+              <w:pStyle w:val="Compact"/>
+            </w:pPr>
+            <w:r>
+              <w:t xml:space="preserve">Acceptance of Testing</w:t>
+            </w:r>
+          </w:p>
+        </w:tc>
+      </w:tr>
+      <w:tr>
+        <w:tc>
+          <w:tcPr/>
+          <w:p>
+            <w:pPr>
+              <w:pStyle w:val="Compact"/>
+            </w:pPr>
+            <w:r>
+              <w:t xml:space="preserve">Deployment</w:t>
+            </w:r>
+          </w:p>
+        </w:tc>
+        <w:tc>
+          <w:tcPr/>
+          <w:p>
+            <w:pPr>
+              <w:pStyle w:val="Compact"/>
+            </w:pPr>
+            <w:r>
+              <w:rPr>
+                <w:rStyle w:val="VerbatimChar"/>
+              </w:rPr>
+              <w:t xml:space="preserve">{{DEPLOYMENT_DELIVERABLES}}</w:t>
+            </w:r>
+          </w:p>
+        </w:tc>
+        <w:tc>
+          <w:tcPr/>
+          <w:p>
+            <w:pPr>
+              <w:pStyle w:val="Compact"/>
+              <w:jc w:val="right"/>
+            </w:pPr>
+            <w:r>
+              <w:rPr>
+                <w:rStyle w:val="VerbatimChar"/>
+              </w:rPr>
+              <w:t xml:space="preserve">{{DEPLOYMENT_ONE_TIME}}</w:t>
+            </w:r>
+          </w:p>
+        </w:tc>
+        <w:tc>
+          <w:tcPr/>
+          <w:p>
+            <w:pPr>
+              <w:pStyle w:val="Compact"/>
+              <w:jc w:val="right"/>
+            </w:pPr>
+            <w:r>
+              <w:rPr>
+                <w:rStyle w:val="VerbatimChar"/>
+              </w:rPr>
+              <w:t xml:space="preserve">{{DEPLOYMENT_MONTHLY}}</w:t>
+            </w:r>
+          </w:p>
+        </w:tc>
+        <w:tc>
+          <w:tcPr/>
+          <w:p>
+            <w:pPr>
+              <w:pStyle w:val="Compact"/>
+              <w:jc w:val="right"/>
+            </w:pPr>
+            <w:r>
+              <w:rPr>
+                <w:rStyle w:val="VerbatimChar"/>
+              </w:rPr>
+              <w:t xml:space="preserve">{{DEPLOYMENT_YEARLY}}</w:t>
+            </w:r>
+          </w:p>
+        </w:tc>
+        <w:tc>
+          <w:tcPr/>
+          <w:p>
+            <w:pPr>
+              <w:pStyle w:val="Compact"/>
+            </w:pPr>
+            <w:r>
+              <w:t xml:space="preserve">Go-live acceptance</w:t>
+            </w:r>
+          </w:p>
+        </w:tc>
+      </w:tr>
+      <w:tr>
+        <w:tc>
+          <w:tcPr/>
+          <w:p>
+            <w:pPr>
+              <w:pStyle w:val="Compact"/>
+            </w:pPr>
+            <w:r>
+              <w:t xml:space="preserve">Maintenance</w:t>
+            </w:r>
+          </w:p>
+        </w:tc>
+        <w:tc>
+          <w:tcPr/>
+          <w:p>
+            <w:pPr>
+              <w:pStyle w:val="Compact"/>
+            </w:pPr>
+            <w:r>
+              <w:rPr>
+                <w:rStyle w:val="VerbatimChar"/>
+              </w:rPr>
+              <w:t xml:space="preserve">{{MAINTENANCE_DELIVERABLES}}</w:t>
+            </w:r>
+          </w:p>
+        </w:tc>
+        <w:tc>
+          <w:tcPr/>
+          <w:p>
+            <w:pPr>
+              <w:pStyle w:val="Compact"/>
+              <w:jc w:val="right"/>
+            </w:pPr>
+            <w:r>
+              <w:rPr>
+                <w:rStyle w:val="VerbatimChar"/>
+              </w:rPr>
+              <w:t xml:space="preserve">{{MAINTENANCE_ONE_TIME}}</w:t>
+            </w:r>
+          </w:p>
+        </w:tc>
+        <w:tc>
+          <w:tcPr/>
+          <w:p>
+            <w:pPr>
+              <w:pStyle w:val="Compact"/>
+              <w:jc w:val="right"/>
+            </w:pPr>
+            <w:r>
+              <w:rPr>
+                <w:rStyle w:val="VerbatimChar"/>
+              </w:rPr>
+              <w:t xml:space="preserve">{{MAINTENANCE_MONTHLY}}</w:t>
+            </w:r>
+          </w:p>
+        </w:tc>
+        <w:tc>
+          <w:tcPr/>
+          <w:p>
+            <w:pPr>
+              <w:pStyle w:val="Compact"/>
+              <w:jc w:val="right"/>
+            </w:pPr>
+            <w:r>
+              <w:rPr>
+                <w:rStyle w:val="VerbatimChar"/>
+              </w:rPr>
+              <w:t xml:space="preserve">{{MAINTENANCE_YEARLY}}</w:t>
+            </w:r>
+          </w:p>
+        </w:tc>
+        <w:tc>
+          <w:tcPr/>
+          <w:p>
+            <w:pPr>
+              <w:pStyle w:val="Compact"/>
+            </w:pPr>
+            <w:r>
+              <w:t xml:space="preserve">Per support agreement</w:t>
+            </w:r>
+          </w:p>
+        </w:tc>
+      </w:tr>
+      <w:tr>
+        <w:tc>
+          <w:tcPr/>
+          <w:p>
+            <w:pPr>
+              <w:pStyle w:val="Compact"/>
+            </w:pPr>
+            <w:r>
+              <w:rPr>
+                <w:b/>
+                <w:bCs/>
+              </w:rPr>
+              <w:t xml:space="preserve">Total</w:t>
+            </w:r>
+          </w:p>
+        </w:tc>
+        <w:tc>
+          <w:tcPr/>
+          <w:p>
+            <w:pPr>
+              <w:pStyle w:val="Compact"/>
+            </w:pPr>
+          </w:p>
+        </w:tc>
+        <w:tc>
+          <w:tcPr/>
+          <w:p>
+            <w:pPr>
+              <w:pStyle w:val="Compact"/>
+              <w:jc w:val="right"/>
+            </w:pPr>
+            <w:r>
+              <w:rPr>
+                <w:rStyle w:val="VerbatimChar"/>
+              </w:rPr>
+              <w:t xml:space="preserve">{{MILESTONE_TOTAL}}</w:t>
+            </w:r>
+          </w:p>
+        </w:tc>
+        <w:tc>
+          <w:tcPr/>
+          <w:p>
+            <w:pPr>
+              <w:pStyle w:val="Compact"/>
+              <w:jc w:val="right"/>
+            </w:pPr>
+            <w:r>
+              <w:rPr>
+                <w:rStyle w:val="VerbatimChar"/>
+              </w:rPr>
+              <w:t xml:space="preserve">{{MONTHLY_TOTAL}}</w:t>
+            </w:r>
+          </w:p>
+        </w:tc>
+        <w:tc>
+          <w:tcPr/>
+          <w:p>
+            <w:pPr>
+              <w:pStyle w:val="Compact"/>
+              <w:jc w:val="right"/>
+            </w:pPr>
+            <w:r>
+              <w:rPr>
+                <w:rStyle w:val="VerbatimChar"/>
+              </w:rPr>
+              <w:t xml:space="preserve">{{YEARLY_TOTAL}}</w:t>
+            </w:r>
+          </w:p>
+        </w:tc>
+        <w:tc>
+          <w:tcPr/>
+          <w:p>
+            <w:pPr>
+              <w:pStyle w:val="Compact"/>
+            </w:pPr>
           </w:p>
         </w:tc>
       </w:tr>
     </w:tbl>
+    <w:p>
+      <w:pPr>
+        <w:pStyle w:val="BlockText"/>
+      </w:pPr>
+      <w:r>
+        <w:t xml:space="preserve">Each milestone fee is invoiced upon the Client’s acceptance of that phase. Phase fees exclude the</w:t>
+      </w:r>
+      <w:r>
+        <w:t xml:space="preserve"> </w:t>
+      </w:r>
+      <w:r>
+        <w:t xml:space="preserve">project contingency (carried in §23 Pricing). Phases with no cost may be omitted; add custom</w:t>
+      </w:r>
+      <w:r>
+        <w:t xml:space="preserve"> </w:t>
+      </w:r>
+      <w:r>
+        <w:t xml:space="preserve">phases as needed.</w:t>
+      </w:r>
+    </w:p>
     <w:p>
       <w:r>
         <w:pict>

</xml_diff>

<commit_message>
feat(sow): per-SDLC-phase milestone schedule for Deliverables (BR-7) (#99)
Replace the generic "Deliverable 1/2/3" with a phase-based milestone
schedule: each SDLC phase is a billable milestone invoiced on acceptance,
priced from the estimate's cost-per-phase (which already flows into the SOW
as pricing.phases).

- SowPrintPage §7 → "Deliverables & Milestone Schedule": editable intro + a
  computed table (Phase/Milestone · one-time milestone fee · recurring
  monthly · recurring yearly + totals), with an invoice-on-acceptance note;
  amounts exclude contingency (carried in §9 Pricing). Pricing stays §9.
- SOW default deliverables boilerplate now describes phase-milestone billing.
- SOW_TEMPLATE.md §9 rewritten to a phase/milestone schedule with {{PHASE_*}}
  tokens + invoice triggers; .docx re-rendered.

Co-authored-by: Tito Morales <support@veridion.com>
Co-authored-by: Claude Opus 4.8 (1M context) <noreply@anthropic.com>
</commit_message>
<xml_diff>
--- a/docs/templates/SOW_TEMPLATE.docx
+++ b/docs/templates/SOW_TEMPLATE.docx
@@ -3315,13 +3315,119 @@
       </w:r>
     </w:p>
     <w:bookmarkEnd w:id="28"/>
-    <w:bookmarkStart w:id="29" w:name="deliverables"/>
+    <w:bookmarkStart w:id="29" w:name="deliverables-milestone-schedule"/>
     <w:p>
       <w:pPr>
         <w:pStyle w:val="Heading2"/>
       </w:pPr>
       <w:r>
-        <w:t xml:space="preserve">9. Deliverables</w:t>
+        <w:t xml:space="preserve">9. Deliverables &amp; Milestone Schedule</w:t>
+      </w:r>
+    </w:p>
+    <w:p>
+      <w:pPr>
+        <w:pStyle w:val="FirstParagraph"/>
+      </w:pPr>
+      <w:r>
+        <w:t xml:space="preserve">Deliverables are organized by</w:t>
+      </w:r>
+      <w:r>
+        <w:t xml:space="preserve"> </w:t>
+      </w:r>
+      <w:r>
+        <w:rPr>
+          <w:b/>
+          <w:bCs/>
+        </w:rPr>
+        <w:t xml:space="preserve">SDLC phase</w:t>
+      </w:r>
+      <w:r>
+        <w:t xml:space="preserve">. Each phase is a</w:t>
+      </w:r>
+      <w:r>
+        <w:t xml:space="preserve"> </w:t>
+      </w:r>
+      <w:r>
+        <w:rPr>
+          <w:b/>
+          <w:bCs/>
+        </w:rPr>
+        <w:t xml:space="preserve">billable milestone</w:t>
+      </w:r>
+      <w:r>
+        <w:t xml:space="preserve">: upon the</w:t>
+      </w:r>
+      <w:r>
+        <w:t xml:space="preserve"> </w:t>
+      </w:r>
+      <w:r>
+        <w:t xml:space="preserve">Client’s written acceptance of that phase’s deliverables, the Provider invoices the phase’s</w:t>
+      </w:r>
+      <w:r>
+        <w:t xml:space="preserve"> </w:t>
+      </w:r>
+      <w:r>
+        <w:rPr>
+          <w:b/>
+          <w:bCs/>
+        </w:rPr>
+        <w:t xml:space="preserve">one-time milestone fee</w:t>
+      </w:r>
+      <w:r>
+        <w:t xml:space="preserve"> </w:t>
+      </w:r>
+      <w:r>
+        <w:t xml:space="preserve">per the schedule below. The fees are derived from the approved</w:t>
+      </w:r>
+      <w:r>
+        <w:t xml:space="preserve"> </w:t>
+      </w:r>
+      <w:r>
+        <w:t xml:space="preserve">estimate’s</w:t>
+      </w:r>
+      <w:r>
+        <w:t xml:space="preserve"> </w:t>
+      </w:r>
+      <w:r>
+        <w:rPr>
+          <w:b/>
+          <w:bCs/>
+        </w:rPr>
+        <w:t xml:space="preserve">cost per phase</w:t>
+      </w:r>
+      <w:r>
+        <w:t xml:space="preserve"> </w:t>
+      </w:r>
+      <w:r>
+        <w:t xml:space="preserve">— when generated from a Kerdos estimate, this table is populated</w:t>
+      </w:r>
+      <w:r>
+        <w:t xml:space="preserve"> </w:t>
+      </w:r>
+      <w:r>
+        <w:t xml:space="preserve">from the estimate’s per-phase totals. Recurring costs (e.g. cloud, licenses) are billed on their</w:t>
+      </w:r>
+      <w:r>
+        <w:t xml:space="preserve"> </w:t>
+      </w:r>
+      <w:r>
+        <w:t xml:space="preserve">stated cadence and are</w:t>
+      </w:r>
+      <w:r>
+        <w:t xml:space="preserve"> </w:t>
+      </w:r>
+      <w:r>
+        <w:rPr>
+          <w:b/>
+          <w:bCs/>
+        </w:rPr>
+        <w:t xml:space="preserve">not</w:t>
+      </w:r>
+      <w:r>
+        <w:t xml:space="preserve"> </w:t>
+      </w:r>
+      <w:r>
+        <w:t xml:space="preserve">milestones.</w:t>
       </w:r>
     </w:p>
     <w:tbl>
@@ -3332,9 +3438,12 @@
         <w:tblLook w:firstRow="1" w:lastRow="0" w:firstColumn="0" w:lastColumn="0" w:noHBand="0" w:noVBand="0" w:val="0020"/>
       </w:tblPr>
       <w:tblGrid>
-        <w:gridCol w:w="1949"/>
-        <w:gridCol w:w="3228"/>
-        <w:gridCol w:w="2741"/>
+        <w:gridCol w:w="1146"/>
+        <w:gridCol w:w="1563"/>
+        <w:gridCol w:w="1354"/>
+        <w:gridCol w:w="1302"/>
+        <w:gridCol w:w="1250"/>
+        <w:gridCol w:w="1302"/>
       </w:tblGrid>
       <w:tr>
         <w:trPr>
@@ -3347,594 +3456,666 @@
               <w:pStyle w:val="Compact"/>
             </w:pPr>
             <w:r>
-              <w:t xml:space="preserve">Deliverable</w:t>
-            </w:r>
-          </w:p>
-        </w:tc>
-        <w:tc>
-          <w:tcPr/>
-          <w:p>
-            <w:pPr>
-              <w:pStyle w:val="Compact"/>
-            </w:pPr>
-            <w:r>
-              <w:t xml:space="preserve">Description</w:t>
-            </w:r>
-          </w:p>
-        </w:tc>
-        <w:tc>
-          <w:tcPr/>
-          <w:p>
-            <w:pPr>
-              <w:pStyle w:val="Compact"/>
-            </w:pPr>
-            <w:r>
-              <w:t xml:space="preserve">Acceptance Criteria</w:t>
-            </w:r>
-          </w:p>
-        </w:tc>
-      </w:tr>
-      <w:tr>
-        <w:tc>
-          <w:tcPr/>
-          <w:p>
-            <w:pPr>
-              <w:pStyle w:val="Compact"/>
-            </w:pPr>
-            <w:r>
-              <w:t xml:space="preserve">Project Management Plan</w:t>
-            </w:r>
-          </w:p>
-        </w:tc>
-        <w:tc>
-          <w:tcPr/>
-          <w:p>
-            <w:pPr>
-              <w:pStyle w:val="Compact"/>
-            </w:pPr>
-            <w:r>
-              <w:t xml:space="preserve">Schedule, governance, risks, communication, reporting</w:t>
-            </w:r>
-          </w:p>
-        </w:tc>
-        <w:tc>
-          <w:tcPr/>
-          <w:p>
-            <w:pPr>
-              <w:pStyle w:val="Compact"/>
-            </w:pPr>
-            <w:r>
-              <w:t xml:space="preserve">Approved by customer</w:t>
-            </w:r>
-          </w:p>
-        </w:tc>
-      </w:tr>
-      <w:tr>
-        <w:tc>
-          <w:tcPr/>
-          <w:p>
-            <w:pPr>
-              <w:pStyle w:val="Compact"/>
-            </w:pPr>
-            <w:r>
-              <w:t xml:space="preserve">Requirements Document</w:t>
-            </w:r>
-          </w:p>
-        </w:tc>
-        <w:tc>
-          <w:tcPr/>
-          <w:p>
-            <w:pPr>
-              <w:pStyle w:val="Compact"/>
-            </w:pPr>
-            <w:r>
-              <w:t xml:space="preserve">Functional and non-functional requirements</w:t>
-            </w:r>
-          </w:p>
-        </w:tc>
-        <w:tc>
-          <w:tcPr/>
-          <w:p>
-            <w:pPr>
-              <w:pStyle w:val="Compact"/>
-            </w:pPr>
-            <w:r>
-              <w:t xml:space="preserve">Approved by business + technical stakeholders</w:t>
-            </w:r>
-          </w:p>
-        </w:tc>
-      </w:tr>
-      <w:tr>
-        <w:tc>
-          <w:tcPr/>
-          <w:p>
-            <w:pPr>
-              <w:pStyle w:val="Compact"/>
-            </w:pPr>
-            <w:r>
-              <w:t xml:space="preserve">Requirements Traceability Matrix</w:t>
-            </w:r>
-          </w:p>
-        </w:tc>
-        <w:tc>
-          <w:tcPr/>
-          <w:p>
-            <w:pPr>
-              <w:pStyle w:val="Compact"/>
-            </w:pPr>
-            <w:r>
-              <w:t xml:space="preserve">Maps requirements to design, build, test, acceptance</w:t>
-            </w:r>
-          </w:p>
-        </w:tc>
-        <w:tc>
-          <w:tcPr/>
-          <w:p>
-            <w:pPr>
-              <w:pStyle w:val="Compact"/>
-            </w:pPr>
-            <w:r>
-              <w:t xml:space="preserve">Complete and reviewed</w:t>
-            </w:r>
-          </w:p>
-        </w:tc>
-      </w:tr>
-      <w:tr>
-        <w:tc>
-          <w:tcPr/>
-          <w:p>
-            <w:pPr>
-              <w:pStyle w:val="Compact"/>
-            </w:pPr>
-            <w:r>
-              <w:t xml:space="preserve">Solution Architecture Document</w:t>
-            </w:r>
-          </w:p>
-        </w:tc>
-        <w:tc>
-          <w:tcPr/>
-          <w:p>
-            <w:pPr>
-              <w:pStyle w:val="Compact"/>
-            </w:pPr>
-            <w:r>
-              <w:t xml:space="preserve">Target architecture and major design decisions</w:t>
-            </w:r>
-          </w:p>
-        </w:tc>
-        <w:tc>
-          <w:tcPr/>
-          <w:p>
-            <w:pPr>
-              <w:pStyle w:val="Compact"/>
-            </w:pPr>
-            <w:r>
-              <w:t xml:space="preserve">Approved by architecture stakeholders</w:t>
-            </w:r>
-          </w:p>
-        </w:tc>
-      </w:tr>
-      <w:tr>
-        <w:tc>
-          <w:tcPr/>
-          <w:p>
-            <w:pPr>
-              <w:pStyle w:val="Compact"/>
-            </w:pPr>
-            <w:r>
-              <w:t xml:space="preserve">Technical Design Document</w:t>
-            </w:r>
-          </w:p>
-        </w:tc>
-        <w:tc>
-          <w:tcPr/>
-          <w:p>
-            <w:pPr>
-              <w:pStyle w:val="Compact"/>
-            </w:pPr>
-            <w:r>
-              <w:t xml:space="preserve">Application, data, integration, security design</w:t>
-            </w:r>
-          </w:p>
-        </w:tc>
-        <w:tc>
-          <w:tcPr/>
-          <w:p>
-            <w:pPr>
-              <w:pStyle w:val="Compact"/>
-            </w:pPr>
-            <w:r>
-              <w:t xml:space="preserve">Approved by technical stakeholders</w:t>
-            </w:r>
-          </w:p>
-        </w:tc>
-      </w:tr>
-      <w:tr>
-        <w:tc>
-          <w:tcPr/>
-          <w:p>
-            <w:pPr>
-              <w:pStyle w:val="Compact"/>
-            </w:pPr>
-            <w:r>
-              <w:t xml:space="preserve">Data Model</w:t>
-            </w:r>
-          </w:p>
-        </w:tc>
-        <w:tc>
-          <w:tcPr/>
-          <w:p>
-            <w:pPr>
-              <w:pStyle w:val="Compact"/>
-            </w:pPr>
-            <w:r>
-              <w:t xml:space="preserve">Logical and physical data structures</w:t>
-            </w:r>
-          </w:p>
-        </w:tc>
-        <w:tc>
-          <w:tcPr/>
-          <w:p>
-            <w:pPr>
-              <w:pStyle w:val="Compact"/>
-            </w:pPr>
-            <w:r>
-              <w:t xml:space="preserve">Reviewed and approved</w:t>
-            </w:r>
-          </w:p>
-        </w:tc>
-      </w:tr>
-      <w:tr>
-        <w:tc>
-          <w:tcPr/>
-          <w:p>
-            <w:pPr>
-              <w:pStyle w:val="Compact"/>
-            </w:pPr>
-            <w:r>
-              <w:t xml:space="preserve">Integration Design</w:t>
-            </w:r>
-          </w:p>
-        </w:tc>
-        <w:tc>
-          <w:tcPr/>
-          <w:p>
-            <w:pPr>
-              <w:pStyle w:val="Compact"/>
-            </w:pPr>
-            <w:r>
-              <w:t xml:space="preserve">APIs, batch jobs, files, messages, event flows</w:t>
-            </w:r>
-          </w:p>
-        </w:tc>
-        <w:tc>
-          <w:tcPr/>
-          <w:p>
-            <w:pPr>
-              <w:pStyle w:val="Compact"/>
-            </w:pPr>
-            <w:r>
-              <w:t xml:space="preserve">Reviewed and approved</w:t>
-            </w:r>
-          </w:p>
-        </w:tc>
-      </w:tr>
-      <w:tr>
-        <w:tc>
-          <w:tcPr/>
-          <w:p>
-            <w:pPr>
-              <w:pStyle w:val="Compact"/>
-            </w:pPr>
-            <w:r>
-              <w:t xml:space="preserve">Security Design</w:t>
-            </w:r>
-          </w:p>
-        </w:tc>
-        <w:tc>
-          <w:tcPr/>
-          <w:p>
-            <w:pPr>
-              <w:pStyle w:val="Compact"/>
-            </w:pPr>
-            <w:r>
-              <w:t xml:space="preserve">Authn, authz, encryption, logging, controls</w:t>
-            </w:r>
-          </w:p>
-        </w:tc>
-        <w:tc>
-          <w:tcPr/>
-          <w:p>
-            <w:pPr>
-              <w:pStyle w:val="Compact"/>
-            </w:pPr>
-            <w:r>
-              <w:t xml:space="preserve">Approved by security stakeholders</w:t>
-            </w:r>
-          </w:p>
-        </w:tc>
-      </w:tr>
-      <w:tr>
-        <w:tc>
-          <w:tcPr/>
-          <w:p>
-            <w:pPr>
-              <w:pStyle w:val="Compact"/>
-            </w:pPr>
-            <w:r>
-              <w:t xml:space="preserve">Test Strategy</w:t>
-            </w:r>
-          </w:p>
-        </w:tc>
-        <w:tc>
-          <w:tcPr/>
-          <w:p>
-            <w:pPr>
-              <w:pStyle w:val="Compact"/>
-            </w:pPr>
-            <w:r>
-              <w:t xml:space="preserve">Testing approach and responsibilities</w:t>
-            </w:r>
-          </w:p>
-        </w:tc>
-        <w:tc>
-          <w:tcPr/>
-          <w:p>
-            <w:pPr>
-              <w:pStyle w:val="Compact"/>
-            </w:pPr>
-            <w:r>
-              <w:t xml:space="preserve">Approved by project leadership</w:t>
-            </w:r>
-          </w:p>
-        </w:tc>
-      </w:tr>
-      <w:tr>
-        <w:tc>
-          <w:tcPr/>
-          <w:p>
-            <w:pPr>
-              <w:pStyle w:val="Compact"/>
-            </w:pPr>
-            <w:r>
-              <w:t xml:space="preserve">Test Cases and Results</w:t>
-            </w:r>
-          </w:p>
-        </w:tc>
-        <w:tc>
-          <w:tcPr/>
-          <w:p>
-            <w:pPr>
-              <w:pStyle w:val="Compact"/>
-            </w:pPr>
-            <w:r>
-              <w:t xml:space="preserve">Executed tests and results</w:t>
-            </w:r>
-          </w:p>
-        </w:tc>
-        <w:tc>
-          <w:tcPr/>
-          <w:p>
-            <w:pPr>
-              <w:pStyle w:val="Compact"/>
-            </w:pPr>
-            <w:r>
-              <w:t xml:space="preserve">Meets exit criteria</w:t>
-            </w:r>
-          </w:p>
-        </w:tc>
-      </w:tr>
-      <w:tr>
-        <w:tc>
-          <w:tcPr/>
-          <w:p>
-            <w:pPr>
-              <w:pStyle w:val="Compact"/>
-            </w:pPr>
-            <w:r>
-              <w:t xml:space="preserve">Deployment Plan</w:t>
-            </w:r>
-          </w:p>
-        </w:tc>
-        <w:tc>
-          <w:tcPr/>
-          <w:p>
-            <w:pPr>
-              <w:pStyle w:val="Compact"/>
-            </w:pPr>
-            <w:r>
-              <w:t xml:space="preserve">Production implementation steps</w:t>
-            </w:r>
-          </w:p>
-        </w:tc>
-        <w:tc>
-          <w:tcPr/>
-          <w:p>
-            <w:pPr>
-              <w:pStyle w:val="Compact"/>
-            </w:pPr>
-            <w:r>
-              <w:t xml:space="preserve">Approved before go-live</w:t>
-            </w:r>
-          </w:p>
-        </w:tc>
-      </w:tr>
-      <w:tr>
-        <w:tc>
-          <w:tcPr/>
-          <w:p>
-            <w:pPr>
-              <w:pStyle w:val="Compact"/>
-            </w:pPr>
-            <w:r>
-              <w:t xml:space="preserve">Rollback Plan</w:t>
-            </w:r>
-          </w:p>
-        </w:tc>
-        <w:tc>
-          <w:tcPr/>
-          <w:p>
-            <w:pPr>
-              <w:pStyle w:val="Compact"/>
-            </w:pPr>
-            <w:r>
-              <w:t xml:space="preserve">Recovery approach if deployment fails</w:t>
-            </w:r>
-          </w:p>
-        </w:tc>
-        <w:tc>
-          <w:tcPr/>
-          <w:p>
-            <w:pPr>
-              <w:pStyle w:val="Compact"/>
-            </w:pPr>
-            <w:r>
-              <w:t xml:space="preserve">Approved before go-live</w:t>
-            </w:r>
-          </w:p>
-        </w:tc>
-      </w:tr>
-      <w:tr>
-        <w:tc>
-          <w:tcPr/>
-          <w:p>
-            <w:pPr>
-              <w:pStyle w:val="Compact"/>
-            </w:pPr>
-            <w:r>
-              <w:t xml:space="preserve">User Guide</w:t>
-            </w:r>
-          </w:p>
-        </w:tc>
-        <w:tc>
-          <w:tcPr/>
-          <w:p>
-            <w:pPr>
-              <w:pStyle w:val="Compact"/>
-            </w:pPr>
-            <w:r>
-              <w:t xml:space="preserve">Supports end-user adoption</w:t>
-            </w:r>
-          </w:p>
-        </w:tc>
-        <w:tc>
-          <w:tcPr/>
-          <w:p>
-            <w:pPr>
-              <w:pStyle w:val="Compact"/>
-            </w:pPr>
-            <w:r>
-              <w:t xml:space="preserve">Reviewed and accepted</w:t>
-            </w:r>
-          </w:p>
-        </w:tc>
-      </w:tr>
-      <w:tr>
-        <w:tc>
-          <w:tcPr/>
-          <w:p>
-            <w:pPr>
-              <w:pStyle w:val="Compact"/>
-            </w:pPr>
-            <w:r>
-              <w:t xml:space="preserve">Operations Runbook</w:t>
-            </w:r>
-          </w:p>
-        </w:tc>
-        <w:tc>
-          <w:tcPr/>
-          <w:p>
-            <w:pPr>
-              <w:pStyle w:val="Compact"/>
-            </w:pPr>
-            <w:r>
-              <w:t xml:space="preserve">Supports production operations</w:t>
-            </w:r>
-          </w:p>
-        </w:tc>
-        <w:tc>
-          <w:tcPr/>
-          <w:p>
-            <w:pPr>
-              <w:pStyle w:val="Compact"/>
-            </w:pPr>
-            <w:r>
-              <w:t xml:space="preserve">Reviewed and accepted</w:t>
-            </w:r>
-          </w:p>
-        </w:tc>
-      </w:tr>
-      <w:tr>
-        <w:tc>
-          <w:tcPr/>
-          <w:p>
-            <w:pPr>
-              <w:pStyle w:val="Compact"/>
-            </w:pPr>
-            <w:r>
-              <w:t xml:space="preserve">Knowledge Transfer Materials</w:t>
-            </w:r>
-          </w:p>
-        </w:tc>
-        <w:tc>
-          <w:tcPr/>
-          <w:p>
-            <w:pPr>
-              <w:pStyle w:val="Compact"/>
-            </w:pPr>
-            <w:r>
-              <w:t xml:space="preserve">Supports customer/support handoff</w:t>
-            </w:r>
-          </w:p>
-        </w:tc>
-        <w:tc>
-          <w:tcPr/>
-          <w:p>
-            <w:pPr>
-              <w:pStyle w:val="Compact"/>
-            </w:pPr>
-            <w:r>
-              <w:t xml:space="preserve">Delivered and reviewed</w:t>
-            </w:r>
-          </w:p>
-        </w:tc>
-      </w:tr>
-      <w:tr>
-        <w:tc>
-          <w:tcPr/>
-          <w:p>
-            <w:pPr>
-              <w:pStyle w:val="Compact"/>
-            </w:pPr>
-            <w:r>
-              <w:t xml:space="preserve">Final Acceptance Package</w:t>
-            </w:r>
-          </w:p>
-        </w:tc>
-        <w:tc>
-          <w:tcPr/>
-          <w:p>
-            <w:pPr>
-              <w:pStyle w:val="Compact"/>
-            </w:pPr>
-            <w:r>
-              <w:t xml:space="preserve">Confirms delivery completion</w:t>
-            </w:r>
-          </w:p>
-        </w:tc>
-        <w:tc>
-          <w:tcPr/>
-          <w:p>
-            <w:pPr>
-              <w:pStyle w:val="Compact"/>
-            </w:pPr>
-            <w:r>
-              <w:t xml:space="preserve">Signed by customer</w:t>
-            </w:r>
+              <w:t xml:space="preserve">SDLC Phase (Milestone)</w:t>
+            </w:r>
+          </w:p>
+        </w:tc>
+        <w:tc>
+          <w:tcPr/>
+          <w:p>
+            <w:pPr>
+              <w:pStyle w:val="Compact"/>
+            </w:pPr>
+            <w:r>
+              <w:t xml:space="preserve">Key Deliverables</w:t>
+            </w:r>
+          </w:p>
+        </w:tc>
+        <w:tc>
+          <w:tcPr/>
+          <w:p>
+            <w:pPr>
+              <w:pStyle w:val="Compact"/>
+              <w:jc w:val="right"/>
+            </w:pPr>
+            <w:r>
+              <w:t xml:space="preserve">Milestone Fee (one-time)</w:t>
+            </w:r>
+          </w:p>
+        </w:tc>
+        <w:tc>
+          <w:tcPr/>
+          <w:p>
+            <w:pPr>
+              <w:pStyle w:val="Compact"/>
+              <w:jc w:val="right"/>
+            </w:pPr>
+            <w:r>
+              <w:t xml:space="preserve">Recurring (monthly)</w:t>
+            </w:r>
+          </w:p>
+        </w:tc>
+        <w:tc>
+          <w:tcPr/>
+          <w:p>
+            <w:pPr>
+              <w:pStyle w:val="Compact"/>
+              <w:jc w:val="right"/>
+            </w:pPr>
+            <w:r>
+              <w:t xml:space="preserve">Recurring (yearly)</w:t>
+            </w:r>
+          </w:p>
+        </w:tc>
+        <w:tc>
+          <w:tcPr/>
+          <w:p>
+            <w:pPr>
+              <w:pStyle w:val="Compact"/>
+            </w:pPr>
+            <w:r>
+              <w:t xml:space="preserve">Invoice Trigger</w:t>
+            </w:r>
+          </w:p>
+        </w:tc>
+      </w:tr>
+      <w:tr>
+        <w:tc>
+          <w:tcPr/>
+          <w:p>
+            <w:pPr>
+              <w:pStyle w:val="Compact"/>
+            </w:pPr>
+            <w:r>
+              <w:t xml:space="preserve">Planning</w:t>
+            </w:r>
+          </w:p>
+        </w:tc>
+        <w:tc>
+          <w:tcPr/>
+          <w:p>
+            <w:pPr>
+              <w:pStyle w:val="Compact"/>
+            </w:pPr>
+            <w:r>
+              <w:rPr>
+                <w:rStyle w:val="VerbatimChar"/>
+              </w:rPr>
+              <w:t xml:space="preserve">{{PLANNING_DELIVERABLES}}</w:t>
+            </w:r>
+          </w:p>
+        </w:tc>
+        <w:tc>
+          <w:tcPr/>
+          <w:p>
+            <w:pPr>
+              <w:pStyle w:val="Compact"/>
+              <w:jc w:val="right"/>
+            </w:pPr>
+            <w:r>
+              <w:rPr>
+                <w:rStyle w:val="VerbatimChar"/>
+              </w:rPr>
+              <w:t xml:space="preserve">{{PLANNING_ONE_TIME}}</w:t>
+            </w:r>
+          </w:p>
+        </w:tc>
+        <w:tc>
+          <w:tcPr/>
+          <w:p>
+            <w:pPr>
+              <w:pStyle w:val="Compact"/>
+              <w:jc w:val="right"/>
+            </w:pPr>
+            <w:r>
+              <w:rPr>
+                <w:rStyle w:val="VerbatimChar"/>
+              </w:rPr>
+              <w:t xml:space="preserve">{{PLANNING_MONTHLY}}</w:t>
+            </w:r>
+          </w:p>
+        </w:tc>
+        <w:tc>
+          <w:tcPr/>
+          <w:p>
+            <w:pPr>
+              <w:pStyle w:val="Compact"/>
+              <w:jc w:val="right"/>
+            </w:pPr>
+            <w:r>
+              <w:rPr>
+                <w:rStyle w:val="VerbatimChar"/>
+              </w:rPr>
+              <w:t xml:space="preserve">{{PLANNING_YEARLY}}</w:t>
+            </w:r>
+          </w:p>
+        </w:tc>
+        <w:tc>
+          <w:tcPr/>
+          <w:p>
+            <w:pPr>
+              <w:pStyle w:val="Compact"/>
+            </w:pPr>
+            <w:r>
+              <w:t xml:space="preserve">Acceptance of Planning</w:t>
+            </w:r>
+          </w:p>
+        </w:tc>
+      </w:tr>
+      <w:tr>
+        <w:tc>
+          <w:tcPr/>
+          <w:p>
+            <w:pPr>
+              <w:pStyle w:val="Compact"/>
+            </w:pPr>
+            <w:r>
+              <w:t xml:space="preserve">Design</w:t>
+            </w:r>
+          </w:p>
+        </w:tc>
+        <w:tc>
+          <w:tcPr/>
+          <w:p>
+            <w:pPr>
+              <w:pStyle w:val="Compact"/>
+            </w:pPr>
+            <w:r>
+              <w:rPr>
+                <w:rStyle w:val="VerbatimChar"/>
+              </w:rPr>
+              <w:t xml:space="preserve">{{DESIGN_DELIVERABLES}}</w:t>
+            </w:r>
+          </w:p>
+        </w:tc>
+        <w:tc>
+          <w:tcPr/>
+          <w:p>
+            <w:pPr>
+              <w:pStyle w:val="Compact"/>
+              <w:jc w:val="right"/>
+            </w:pPr>
+            <w:r>
+              <w:rPr>
+                <w:rStyle w:val="VerbatimChar"/>
+              </w:rPr>
+              <w:t xml:space="preserve">{{DESIGN_ONE_TIME}}</w:t>
+            </w:r>
+          </w:p>
+        </w:tc>
+        <w:tc>
+          <w:tcPr/>
+          <w:p>
+            <w:pPr>
+              <w:pStyle w:val="Compact"/>
+              <w:jc w:val="right"/>
+            </w:pPr>
+            <w:r>
+              <w:rPr>
+                <w:rStyle w:val="VerbatimChar"/>
+              </w:rPr>
+              <w:t xml:space="preserve">{{DESIGN_MONTHLY}}</w:t>
+            </w:r>
+          </w:p>
+        </w:tc>
+        <w:tc>
+          <w:tcPr/>
+          <w:p>
+            <w:pPr>
+              <w:pStyle w:val="Compact"/>
+              <w:jc w:val="right"/>
+            </w:pPr>
+            <w:r>
+              <w:rPr>
+                <w:rStyle w:val="VerbatimChar"/>
+              </w:rPr>
+              <w:t xml:space="preserve">{{DESIGN_YEARLY}}</w:t>
+            </w:r>
+          </w:p>
+        </w:tc>
+        <w:tc>
+          <w:tcPr/>
+          <w:p>
+            <w:pPr>
+              <w:pStyle w:val="Compact"/>
+            </w:pPr>
+            <w:r>
+              <w:t xml:space="preserve">Acceptance of Design</w:t>
+            </w:r>
+          </w:p>
+        </w:tc>
+      </w:tr>
+      <w:tr>
+        <w:tc>
+          <w:tcPr/>
+          <w:p>
+            <w:pPr>
+              <w:pStyle w:val="Compact"/>
+            </w:pPr>
+            <w:r>
+              <w:t xml:space="preserve">Development</w:t>
+            </w:r>
+          </w:p>
+        </w:tc>
+        <w:tc>
+          <w:tcPr/>
+          <w:p>
+            <w:pPr>
+              <w:pStyle w:val="Compact"/>
+            </w:pPr>
+            <w:r>
+              <w:rPr>
+                <w:rStyle w:val="VerbatimChar"/>
+              </w:rPr>
+              <w:t xml:space="preserve">{{DEVELOPMENT_DELIVERABLES}}</w:t>
+            </w:r>
+          </w:p>
+        </w:tc>
+        <w:tc>
+          <w:tcPr/>
+          <w:p>
+            <w:pPr>
+              <w:pStyle w:val="Compact"/>
+              <w:jc w:val="right"/>
+            </w:pPr>
+            <w:r>
+              <w:rPr>
+                <w:rStyle w:val="VerbatimChar"/>
+              </w:rPr>
+              <w:t xml:space="preserve">{{DEVELOPMENT_ONE_TIME}}</w:t>
+            </w:r>
+          </w:p>
+        </w:tc>
+        <w:tc>
+          <w:tcPr/>
+          <w:p>
+            <w:pPr>
+              <w:pStyle w:val="Compact"/>
+              <w:jc w:val="right"/>
+            </w:pPr>
+            <w:r>
+              <w:rPr>
+                <w:rStyle w:val="VerbatimChar"/>
+              </w:rPr>
+              <w:t xml:space="preserve">{{DEVELOPMENT_MONTHLY}}</w:t>
+            </w:r>
+          </w:p>
+        </w:tc>
+        <w:tc>
+          <w:tcPr/>
+          <w:p>
+            <w:pPr>
+              <w:pStyle w:val="Compact"/>
+              <w:jc w:val="right"/>
+            </w:pPr>
+            <w:r>
+              <w:rPr>
+                <w:rStyle w:val="VerbatimChar"/>
+              </w:rPr>
+              <w:t xml:space="preserve">{{DEVELOPMENT_YEARLY}}</w:t>
+            </w:r>
+          </w:p>
+        </w:tc>
+        <w:tc>
+          <w:tcPr/>
+          <w:p>
+            <w:pPr>
+              <w:pStyle w:val="Compact"/>
+            </w:pPr>
+            <w:r>
+              <w:t xml:space="preserve">Acceptance of Development</w:t>
+            </w:r>
+          </w:p>
+        </w:tc>
+      </w:tr>
+      <w:tr>
+        <w:tc>
+          <w:tcPr/>
+          <w:p>
+            <w:pPr>
+              <w:pStyle w:val="Compact"/>
+            </w:pPr>
+            <w:r>
+              <w:t xml:space="preserve">Testing</w:t>
+            </w:r>
+          </w:p>
+        </w:tc>
+        <w:tc>
+          <w:tcPr/>
+          <w:p>
+            <w:pPr>
+              <w:pStyle w:val="Compact"/>
+            </w:pPr>
+            <w:r>
+              <w:rPr>
+                <w:rStyle w:val="VerbatimChar"/>
+              </w:rPr>
+              <w:t xml:space="preserve">{{TESTING_DELIVERABLES}}</w:t>
+            </w:r>
+          </w:p>
+        </w:tc>
+        <w:tc>
+          <w:tcPr/>
+          <w:p>
+            <w:pPr>
+              <w:pStyle w:val="Compact"/>
+              <w:jc w:val="right"/>
+            </w:pPr>
+            <w:r>
+              <w:rPr>
+                <w:rStyle w:val="VerbatimChar"/>
+              </w:rPr>
+              <w:t xml:space="preserve">{{TESTING_ONE_TIME}}</w:t>
+            </w:r>
+          </w:p>
+        </w:tc>
+        <w:tc>
+          <w:tcPr/>
+          <w:p>
+            <w:pPr>
+              <w:pStyle w:val="Compact"/>
+              <w:jc w:val="right"/>
+            </w:pPr>
+            <w:r>
+              <w:rPr>
+                <w:rStyle w:val="VerbatimChar"/>
+              </w:rPr>
+              <w:t xml:space="preserve">{{TESTING_MONTHLY}}</w:t>
+            </w:r>
+          </w:p>
+        </w:tc>
+        <w:tc>
+          <w:tcPr/>
+          <w:p>
+            <w:pPr>
+              <w:pStyle w:val="Compact"/>
+              <w:jc w:val="right"/>
+            </w:pPr>
+            <w:r>
+              <w:rPr>
+                <w:rStyle w:val="VerbatimChar"/>
+              </w:rPr>
+              <w:t xml:space="preserve">{{TESTING_YEARLY}}</w:t>
+            </w:r>
+          </w:p>
+        </w:tc>
+        <w:tc>
+          <w:tcPr/>
+          <w:p>
+            <w:pPr>
+              <w:pStyle w:val="Compact"/>
+            </w:pPr>
+            <w:r>
+              <w:t xml:space="preserve">Acceptance of Testing</w:t>
+            </w:r>
+          </w:p>
+        </w:tc>
+      </w:tr>
+      <w:tr>
+        <w:tc>
+          <w:tcPr/>
+          <w:p>
+            <w:pPr>
+              <w:pStyle w:val="Compact"/>
+            </w:pPr>
+            <w:r>
+              <w:t xml:space="preserve">Deployment</w:t>
+            </w:r>
+          </w:p>
+        </w:tc>
+        <w:tc>
+          <w:tcPr/>
+          <w:p>
+            <w:pPr>
+              <w:pStyle w:val="Compact"/>
+            </w:pPr>
+            <w:r>
+              <w:rPr>
+                <w:rStyle w:val="VerbatimChar"/>
+              </w:rPr>
+              <w:t xml:space="preserve">{{DEPLOYMENT_DELIVERABLES}}</w:t>
+            </w:r>
+          </w:p>
+        </w:tc>
+        <w:tc>
+          <w:tcPr/>
+          <w:p>
+            <w:pPr>
+              <w:pStyle w:val="Compact"/>
+              <w:jc w:val="right"/>
+            </w:pPr>
+            <w:r>
+              <w:rPr>
+                <w:rStyle w:val="VerbatimChar"/>
+              </w:rPr>
+              <w:t xml:space="preserve">{{DEPLOYMENT_ONE_TIME}}</w:t>
+            </w:r>
+          </w:p>
+        </w:tc>
+        <w:tc>
+          <w:tcPr/>
+          <w:p>
+            <w:pPr>
+              <w:pStyle w:val="Compact"/>
+              <w:jc w:val="right"/>
+            </w:pPr>
+            <w:r>
+              <w:rPr>
+                <w:rStyle w:val="VerbatimChar"/>
+              </w:rPr>
+              <w:t xml:space="preserve">{{DEPLOYMENT_MONTHLY}}</w:t>
+            </w:r>
+          </w:p>
+        </w:tc>
+        <w:tc>
+          <w:tcPr/>
+          <w:p>
+            <w:pPr>
+              <w:pStyle w:val="Compact"/>
+              <w:jc w:val="right"/>
+            </w:pPr>
+            <w:r>
+              <w:rPr>
+                <w:rStyle w:val="VerbatimChar"/>
+              </w:rPr>
+              <w:t xml:space="preserve">{{DEPLOYMENT_YEARLY}}</w:t>
+            </w:r>
+          </w:p>
+        </w:tc>
+        <w:tc>
+          <w:tcPr/>
+          <w:p>
+            <w:pPr>
+              <w:pStyle w:val="Compact"/>
+            </w:pPr>
+            <w:r>
+              <w:t xml:space="preserve">Go-live acceptance</w:t>
+            </w:r>
+          </w:p>
+        </w:tc>
+      </w:tr>
+      <w:tr>
+        <w:tc>
+          <w:tcPr/>
+          <w:p>
+            <w:pPr>
+              <w:pStyle w:val="Compact"/>
+            </w:pPr>
+            <w:r>
+              <w:t xml:space="preserve">Maintenance</w:t>
+            </w:r>
+          </w:p>
+        </w:tc>
+        <w:tc>
+          <w:tcPr/>
+          <w:p>
+            <w:pPr>
+              <w:pStyle w:val="Compact"/>
+            </w:pPr>
+            <w:r>
+              <w:rPr>
+                <w:rStyle w:val="VerbatimChar"/>
+              </w:rPr>
+              <w:t xml:space="preserve">{{MAINTENANCE_DELIVERABLES}}</w:t>
+            </w:r>
+          </w:p>
+        </w:tc>
+        <w:tc>
+          <w:tcPr/>
+          <w:p>
+            <w:pPr>
+              <w:pStyle w:val="Compact"/>
+              <w:jc w:val="right"/>
+            </w:pPr>
+            <w:r>
+              <w:rPr>
+                <w:rStyle w:val="VerbatimChar"/>
+              </w:rPr>
+              <w:t xml:space="preserve">{{MAINTENANCE_ONE_TIME}}</w:t>
+            </w:r>
+          </w:p>
+        </w:tc>
+        <w:tc>
+          <w:tcPr/>
+          <w:p>
+            <w:pPr>
+              <w:pStyle w:val="Compact"/>
+              <w:jc w:val="right"/>
+            </w:pPr>
+            <w:r>
+              <w:rPr>
+                <w:rStyle w:val="VerbatimChar"/>
+              </w:rPr>
+              <w:t xml:space="preserve">{{MAINTENANCE_MONTHLY}}</w:t>
+            </w:r>
+          </w:p>
+        </w:tc>
+        <w:tc>
+          <w:tcPr/>
+          <w:p>
+            <w:pPr>
+              <w:pStyle w:val="Compact"/>
+              <w:jc w:val="right"/>
+            </w:pPr>
+            <w:r>
+              <w:rPr>
+                <w:rStyle w:val="VerbatimChar"/>
+              </w:rPr>
+              <w:t xml:space="preserve">{{MAINTENANCE_YEARLY}}</w:t>
+            </w:r>
+          </w:p>
+        </w:tc>
+        <w:tc>
+          <w:tcPr/>
+          <w:p>
+            <w:pPr>
+              <w:pStyle w:val="Compact"/>
+            </w:pPr>
+            <w:r>
+              <w:t xml:space="preserve">Per support agreement</w:t>
+            </w:r>
+          </w:p>
+        </w:tc>
+      </w:tr>
+      <w:tr>
+        <w:tc>
+          <w:tcPr/>
+          <w:p>
+            <w:pPr>
+              <w:pStyle w:val="Compact"/>
+            </w:pPr>
+            <w:r>
+              <w:rPr>
+                <w:b/>
+                <w:bCs/>
+              </w:rPr>
+              <w:t xml:space="preserve">Total</w:t>
+            </w:r>
+          </w:p>
+        </w:tc>
+        <w:tc>
+          <w:tcPr/>
+          <w:p>
+            <w:pPr>
+              <w:pStyle w:val="Compact"/>
+            </w:pPr>
+          </w:p>
+        </w:tc>
+        <w:tc>
+          <w:tcPr/>
+          <w:p>
+            <w:pPr>
+              <w:pStyle w:val="Compact"/>
+              <w:jc w:val="right"/>
+            </w:pPr>
+            <w:r>
+              <w:rPr>
+                <w:rStyle w:val="VerbatimChar"/>
+              </w:rPr>
+              <w:t xml:space="preserve">{{MILESTONE_TOTAL}}</w:t>
+            </w:r>
+          </w:p>
+        </w:tc>
+        <w:tc>
+          <w:tcPr/>
+          <w:p>
+            <w:pPr>
+              <w:pStyle w:val="Compact"/>
+              <w:jc w:val="right"/>
+            </w:pPr>
+            <w:r>
+              <w:rPr>
+                <w:rStyle w:val="VerbatimChar"/>
+              </w:rPr>
+              <w:t xml:space="preserve">{{MONTHLY_TOTAL}}</w:t>
+            </w:r>
+          </w:p>
+        </w:tc>
+        <w:tc>
+          <w:tcPr/>
+          <w:p>
+            <w:pPr>
+              <w:pStyle w:val="Compact"/>
+              <w:jc w:val="right"/>
+            </w:pPr>
+            <w:r>
+              <w:rPr>
+                <w:rStyle w:val="VerbatimChar"/>
+              </w:rPr>
+              <w:t xml:space="preserve">{{YEARLY_TOTAL}}</w:t>
+            </w:r>
+          </w:p>
+        </w:tc>
+        <w:tc>
+          <w:tcPr/>
+          <w:p>
+            <w:pPr>
+              <w:pStyle w:val="Compact"/>
+            </w:pPr>
           </w:p>
         </w:tc>
       </w:tr>
     </w:tbl>
+    <w:p>
+      <w:pPr>
+        <w:pStyle w:val="BlockText"/>
+      </w:pPr>
+      <w:r>
+        <w:t xml:space="preserve">Each milestone fee is invoiced upon the Client’s acceptance of that phase. Phase fees exclude the</w:t>
+      </w:r>
+      <w:r>
+        <w:t xml:space="preserve"> </w:t>
+      </w:r>
+      <w:r>
+        <w:t xml:space="preserve">project contingency (carried in §23 Pricing). Phases with no cost may be omitted; add custom</w:t>
+      </w:r>
+      <w:r>
+        <w:t xml:space="preserve"> </w:t>
+      </w:r>
+      <w:r>
+        <w:t xml:space="preserve">phases as needed.</w:t>
+      </w:r>
+    </w:p>
     <w:p>
       <w:r>
         <w:pict>

</xml_diff>